<commit_message>
Apply 12 pre-submission corrections from editorial review
1.  Section 2.4 rewritten: explain surrogate non-classifiability in TCGA
2.  Sentence added to 2.3: harmonisation affects surrogate feasibility
3.  Table 1: new title + explanatory footnotes (source n, surrogate n, H2H n)
4.  Section 3.2 rewritten: surrogate asymmetry across cohorts explicit
5.  Section 3.3 rewritten: TCGA framed as structurally limited validation
6.  Ethics statement added (publicly available, de-identified data)
7.  Table 4 retitled + footnote clarifying evaluable vs matched subsets
8.  Data availability: code available upon acceptance (choice B)
9.  Figure 6 (information ceiling) moved to Supplementary Fig. S5
10. Conclusions tightened
11. AI declaration made more sober (no specific model names)
12. Subset-labelling sentence added to end of 2.7

Co-Authored-By: Claude Opus 4.6 <noreply@anthropic.com>
</commit_message>
<xml_diff>
--- a/manuscript/manuscript_TheBreast_FINAL.docx
+++ b/manuscript/manuscript_TheBreast_FINAL.docx
@@ -341,7 +341,7 @@
           <w:b/>
           <w:sz w:val="20"/>
         </w:rPr>
-        <w:t>Table 1. Cohort characteristics and evaluable sample sizes by feature set.</w:t>
+        <w:t>Table 1. Cohort characteristics and evaluable sample sizes by feature set and surrogate applicability.</w:t>
       </w:r>
     </w:p>
     <w:tbl>
@@ -796,6 +796,19 @@
         </w:tc>
       </w:tr>
     </w:tbl>
+    <w:p>
+      <w:pPr>
+        <w:spacing w:before="80"/>
+      </w:pPr>
+      <w:r>
+        <w:rPr>
+          <w:rFonts w:ascii="Times New Roman" w:hAnsi="Times New Roman"/>
+          <w:i/>
+          <w:sz w:val="16"/>
+        </w:rPr>
+        <w:t>Abbreviations: PAM50, Prediction Analysis of Microarray 50; IHC, immunohistochemistry. Set 1: ER, PR, HER2. Set 2: Set 1 plus histological grade. Set 3: Set 2 plus Ki-67. Source n refers to the total cohort size available in the source dataset. N (4-class PAM50) refers to tumours with an evaluable 4-class molecular reference label after exclusion of Normal-like and claudin-low categories. N (Surrogate classifiable) refers to tumours for which full 4-class surrogate assignment was possible. In HR-positive/HER2-negative tumours, this required a proliferation variable (Ki-67 or grade) to separate Luminal A-like from Luminal B-like; therefore, surrogate applicability was reduced in TCGA-BRCA, where grade was unavailable and Ki-67 was absent. N (Head-to-head Set 1 vs Surrogate) refers to the exact matched subset classifiable by both the machine-learning model and the surrogate, used for fair denominator comparisons.</w:t>
+      </w:r>
+    </w:p>
     <w:p/>
     <w:p>
       <w:pPr>
@@ -824,6 +837,18 @@
     </w:p>
     <w:p>
       <w:pPr>
+        <w:ind w:firstLine="720"/>
+      </w:pPr>
+      <w:r>
+        <w:rPr>
+          <w:rFonts w:ascii="Times New Roman" w:hAnsi="Times New Roman"/>
+          <w:sz w:val="24"/>
+        </w:rPr>
+        <w:t>This heterogeneity affected not only model portability but also the feasibility of rule-based 4-class surrogate assignment, particularly in HR-positive/HER2-negative tumours requiring a proliferation variable for luminal subclassification.</w:t>
+      </w:r>
+    </w:p>
+    <w:p>
+      <w:pPr>
         <w:spacing w:before="240" w:after="80"/>
       </w:pPr>
       <w:r>
@@ -844,7 +869,43 @@
           <w:rFonts w:ascii="Times New Roman" w:hAnsi="Times New Roman"/>
           <w:sz w:val="24"/>
         </w:rPr>
-        <w:t>The baseline comparator was a St Gallen-like immunohistochemical surrogate [4]. Luminal A-like was defined as HR-positive/HER2-negative with low proliferation; Luminal B-like as HR-positive/HER2-negative with high proliferation or HR-positive/HER2-positive; HER2-positive non-luminal as HR-negative/HER2-positive; and triple-negative as HR-negative/HER2-negative. Proliferation was defined as Ki-67 ≥20% when available, or grade 3 when Ki-67 was not available. Cases missing ER, PR, or HER2 were excluded from surrogate classification.</w:t>
+        <w:t>The baseline comparator was a St Gallen-like immunohistochemical surrogate. Tumours were classified as Luminal A-like, Luminal B-like, HER2-positive non-luminal, or triple-negative according to hormone receptor status, HER2 status, and proliferation information.</w:t>
+      </w:r>
+    </w:p>
+    <w:p>
+      <w:pPr>
+        <w:ind w:firstLine="720"/>
+      </w:pPr>
+      <w:r>
+        <w:rPr>
+          <w:rFonts w:ascii="Times New Roman" w:hAnsi="Times New Roman"/>
+          <w:sz w:val="24"/>
+        </w:rPr>
+        <w:t>Operationally, Luminal A-like was defined as HR-positive/HER2-negative with low proliferation; Luminal B-like as HR-positive/HER2-negative with high proliferation or HR-positive/HER2-positive; HER2-positive non-luminal as HR-negative/HER2-positive; and triple-negative as HR-negative/HER2-negative. Proliferation was defined as Ki-67 ≥20% when available, or grade 3 when Ki-67 was unavailable but grade was present.</w:t>
+      </w:r>
+    </w:p>
+    <w:p>
+      <w:pPr>
+        <w:ind w:firstLine="720"/>
+      </w:pPr>
+      <w:r>
+        <w:rPr>
+          <w:rFonts w:ascii="Times New Roman" w:hAnsi="Times New Roman"/>
+          <w:sz w:val="24"/>
+        </w:rPr>
+        <w:t>Importantly, full 4-class surrogate assignment required a proliferation variable for HR-positive/HER2-negative tumours. Therefore, in cohorts lacking both Ki-67 and grade, HR-positive/HER2-negative cases could not be further subdivided into Luminal A-like versus Luminal B-like and were considered non-classifiable for surrogate-based 4-class assignment. This explains the lower number of surrogate-classifiable cases in TCGA-BRCA despite broader availability of Set 1 variables.</w:t>
+      </w:r>
+    </w:p>
+    <w:p>
+      <w:pPr>
+        <w:ind w:firstLine="720"/>
+      </w:pPr>
+      <w:r>
+        <w:rPr>
+          <w:rFonts w:ascii="Times New Roman" w:hAnsi="Times New Roman"/>
+          <w:sz w:val="24"/>
+        </w:rPr>
+        <w:t>Cases missing ER, PR, or HER2 were also excluded from surrogate classification.</w:t>
       </w:r>
     </w:p>
     <w:p>
@@ -932,6 +993,18 @@
           <w:sz w:val="24"/>
         </w:rPr>
         <w:t>Prespecified sensitivity analyses included: (1) a 3-class formulation in which Luminal A and Luminal B were collapsed into a single luminal class; and (2) a grey-zone analysis based on the maximum predicted class probability, using low (&lt;0.50), intermediate (0.50–0.70), and high (&gt;0.70) confidence bins.</w:t>
+      </w:r>
+    </w:p>
+    <w:p>
+      <w:pPr>
+        <w:ind w:firstLine="720"/>
+      </w:pPr>
+      <w:r>
+        <w:rPr>
+          <w:rFonts w:ascii="Times New Roman" w:hAnsi="Times New Roman"/>
+          <w:sz w:val="24"/>
+        </w:rPr>
+        <w:t>Separate descriptive analyses performed on full model-evaluable subsets are presented only as supportive analyses and should not be interpreted as direct comparisons with the surrogate unless explicitly labelled as matched head-to-head.</w:t>
       </w:r>
     </w:p>
     <w:p>
@@ -1047,7 +1120,7 @@
           <w:rFonts w:ascii="Times New Roman" w:hAnsi="Times New Roman"/>
           <w:sz w:val="24"/>
         </w:rPr>
-        <w:t>The immunohistochemical surrogate was classifiable in 4,694 of 5,377 tumours (87.3%). In METABRIC head-to-head analysis (n=1,554), it achieved macro-F1 0.646 (95% CI 0.623–0.669) and kappa 0.471 (0.436–0.506). Concordance was highest for Basal-like and HER2-enriched tumours and clearly lower for luminal disease.</w:t>
+        <w:t>The immunohistochemical surrogate was classifiable in 4,694 of 5,377 tumours (87.3%), but surrogate applicability varied materially across cohorts because full 4-class assignment required a proliferation variable in HR-positive/HER2-negative disease. This limitation had little impact in METABRIC and the SCAN-B cohorts, but reduced classifiability substantially in TCGA-BRCA, where grade was unavailable and Ki-67 was absent.</w:t>
       </w:r>
     </w:p>
     <w:p>
@@ -1059,7 +1132,19 @@
           <w:rFonts w:ascii="Times New Roman" w:hAnsi="Times New Roman"/>
           <w:sz w:val="24"/>
         </w:rPr>
-        <w:t>The dominant error pattern was crossover at the Luminal A/Luminal B boundary. In METABRIC, 42.5% of molecular Luminal B tumours received a Luminal A-like surrogate label, while 26.9% of molecular Luminal A tumours were overcalled as Luminal B-like (Fig. 2, Table 2). The same general pattern was observed across all cohorts, although TCGA-BRCA showed an unstable extreme due to small evaluable luminal subsets and the absence of grade.</w:t>
+        <w:t>In METABRIC head-to-head analysis (n=1,554), the surrogate achieved macro-F1 0.646 (95% CI 0.623–0.669) and kappa 0.471 (0.436–0.506). Concordance was highest for Basal-like and HER2-enriched tumours and clearly lower for luminal disease.</w:t>
+      </w:r>
+    </w:p>
+    <w:p>
+      <w:pPr>
+        <w:ind w:firstLine="720"/>
+      </w:pPr>
+      <w:r>
+        <w:rPr>
+          <w:rFonts w:ascii="Times New Roman" w:hAnsi="Times New Roman"/>
+          <w:sz w:val="24"/>
+        </w:rPr>
+        <w:t>The dominant error pattern was crossover at the Luminal A/Luminal B boundary. In METABRIC, 42.5% of molecular Luminal B tumours received a Luminal A-like surrogate label, while 26.9% of molecular Luminal A tumours were overcalled as Luminal B-like (Fig. 2, Table 2). The same general pattern was observed across cohorts, although estimates in TCGA-BRCA were less stable because only a restricted subset was surrogate-classifiable.</w:t>
       </w:r>
     </w:p>
     <w:p>
@@ -1528,7 +1613,7 @@
           <w:rFonts w:ascii="Times New Roman" w:hAnsi="Times New Roman"/>
           <w:sz w:val="24"/>
         </w:rPr>
-        <w:t>No machine-learning model outperformed the immunohistochemical surrogate in any external head-to-head comparison (Fig. 3).</w:t>
+        <w:t>No machine-learning model outperformed the immunohistochemical surrogate in any external matched head-to-head comparison.</w:t>
       </w:r>
     </w:p>
     <w:p>
@@ -1540,7 +1625,7 @@
           <w:rFonts w:ascii="Times New Roman" w:hAnsi="Times New Roman"/>
           <w:sz w:val="24"/>
         </w:rPr>
-        <w:t>In METABRIC, the best Set 1 model (XGBoost) achieved macro-F1 0.523 (95% CI 0.503–0.544), substantially below the surrogate. Adding grade improved performance modestly: the best Set 2 model (XGBoost) reached 0.559 (0.533–0.584), but still remained inferior to the surrogate value of 0.644–0.646 depending on the matched subset.</w:t>
+        <w:t>In METABRIC, the best Set 1 model (XGBoost) achieved macro-F1 0.523 (95% CI 0.503–0.544), substantially below the surrogate. Adding grade improved performance modestly: the best Set 2 model (XGBoost) reached 0.559 (0.533–0.584), but remained inferior to the surrogate value of 0.646 in the matched subset.</w:t>
       </w:r>
     </w:p>
     <w:p>
@@ -1552,7 +1637,19 @@
           <w:rFonts w:ascii="Times New Roman" w:hAnsi="Times New Roman"/>
           <w:sz w:val="24"/>
         </w:rPr>
-        <w:t>In TCGA-BRCA, the surrogate achieved macro-F1 0.485 (0.431–0.541) in the head-to-head subset (n=162), whereas the best machine-learning model reached 0.368. Across both external cohorts, the pattern was consistent: grade added some recoverable signal, but the gain was insufficient to match the conventional surrogate.</w:t>
+        <w:t>In TCGA-BRCA, external comparison was intrinsically constrained because only a limited subset was surrogate-classifiable in the absence of grade and Ki-67. Within this matched subset (n=162), the surrogate achieved macro-F1 0.485 (0.431–0.541), whereas the best machine-learning model reached 0.368. Accordingly, TCGA-BRCA should be interpreted as a structurally limited external validation cohort, while METABRIC provides the cleanest external comparison.</w:t>
+      </w:r>
+    </w:p>
+    <w:p>
+      <w:pPr>
+        <w:ind w:firstLine="720"/>
+      </w:pPr>
+      <w:r>
+        <w:rPr>
+          <w:rFonts w:ascii="Times New Roman" w:hAnsi="Times New Roman"/>
+          <w:sz w:val="24"/>
+        </w:rPr>
+        <w:t>Across both external datasets, the overall pattern was consistent: grade added some recoverable signal, but this gain was insufficient to match the conventional surrogate.</w:t>
       </w:r>
     </w:p>
     <w:p>
@@ -2191,7 +2288,7 @@
           <w:b/>
           <w:sz w:val="20"/>
         </w:rPr>
-        <w:t>Table 4. Sensitivity analysis: 4-class versus 3-class performance.</w:t>
+        <w:t>Table 4. Sensitivity analysis comparing 4-class and 3-class performance in model-evaluable subsets.</w:t>
       </w:r>
     </w:p>
     <w:tbl>
@@ -2646,6 +2743,19 @@
         </w:tc>
       </w:tr>
     </w:tbl>
+    <w:p>
+      <w:pPr>
+        <w:spacing w:before="80"/>
+      </w:pPr>
+      <w:r>
+        <w:rPr>
+          <w:rFonts w:ascii="Times New Roman" w:hAnsi="Times New Roman"/>
+          <w:i/>
+          <w:sz w:val="16"/>
+        </w:rPr>
+        <w:t>Values in this table refer to the largest evaluable subset for each machine-learning analysis and are not directly equivalent to matched head-to-head comparisons with the immunohistochemical surrogate. All direct surrogate-versus-model comparisons are reported separately using identical denominators (see Section 3.3).</w:t>
+      </w:r>
+    </w:p>
     <w:p/>
     <w:p>
       <w:pPr>
@@ -2669,60 +2779,7 @@
           <w:rFonts w:ascii="Times New Roman" w:hAnsi="Times New Roman"/>
           <w:sz w:val="24"/>
         </w:rPr>
-        <w:t>Taken together, the results indicate an information ceiling imposed by routine clinicopathological variables (Fig. 6). Adding grade and, where available, Ki-67 produced incremental gains, but these gains plateaued below the surrogate and well below molecular classification. The limiting factor was therefore not model choice, but information content in the inputs.</w:t>
-      </w:r>
-    </w:p>
-    <w:p>
-      <w:pPr>
-        <w:spacing w:before="240"/>
-        <w:jc w:val="center"/>
-      </w:pPr>
-      <w:r>
-        <w:drawing>
-          <wp:inline xmlns:a="http://schemas.openxmlformats.org/drawingml/2006/main" xmlns:pic="http://schemas.openxmlformats.org/drawingml/2006/picture">
-            <wp:extent cx="5029200" cy="3352800"/>
-            <wp:docPr id="6" name="Picture 6"/>
-            <wp:cNvGraphicFramePr>
-              <a:graphicFrameLocks noChangeAspect="1"/>
-            </wp:cNvGraphicFramePr>
-            <a:graphic>
-              <a:graphicData uri="http://schemas.openxmlformats.org/drawingml/2006/picture">
-                <pic:pic>
-                  <pic:nvPicPr>
-                    <pic:cNvPr id="0" name="fig10_information_ceiling.png"/>
-                    <pic:cNvPicPr/>
-                  </pic:nvPicPr>
-                  <pic:blipFill>
-                    <a:blip r:embed="rId14"/>
-                    <a:stretch>
-                      <a:fillRect/>
-                    </a:stretch>
-                  </pic:blipFill>
-                  <pic:spPr>
-                    <a:xfrm>
-                      <a:off x="0" y="0"/>
-                      <a:ext cx="5029200" cy="3352800"/>
-                    </a:xfrm>
-                    <a:prstGeom prst="rect"/>
-                  </pic:spPr>
-                </pic:pic>
-              </a:graphicData>
-            </a:graphic>
-          </wp:inline>
-        </w:drawing>
-      </w:r>
-    </w:p>
-    <w:p>
-      <w:pPr>
-        <w:spacing w:after="240"/>
-      </w:pPr>
-      <w:r>
-        <w:rPr>
-          <w:rFonts w:ascii="Times New Roman" w:hAnsi="Times New Roman"/>
-          <w:i/>
-          <w:sz w:val="20"/>
-        </w:rPr>
-        <w:t>Fig. 6. The information ceiling concept. ML performance improves with feature complexity but plateaus below the IHC surrogate.</w:t>
+        <w:t>Taken together, the results indicate an information ceiling imposed by routine clinicopathological variables. Adding grade and, where available, Ki-67 produced incremental gains, but these gains plateaued below the surrogate and well below molecular classification. The limiting factor was therefore not model choice, but information content in the inputs (Supplementary Fig. S5).</w:t>
       </w:r>
     </w:p>
     <w:p>
@@ -2783,7 +2840,7 @@
           <w:rFonts w:ascii="Times New Roman" w:hAnsi="Times New Roman"/>
           <w:sz w:val="24"/>
         </w:rPr>
-        <w:t>This finding has direct clinical implications. The practical value of molecular subtyping is unlikely to be uniform across all patients. Tumours with clearly non-luminal phenotypes, especially triple-negative and HER2-driven disease, are already reasonably well captured by routine biomarkers. By contrast, hormone receptor-positive/HER2-negative tumours near the Luminal A/Luminal B boundary remain the true zone of irreducible uncertainty [11]. In this context, the grey-zone analysis is useful not because it produces a better classifier, but because it helps identify where routine methods are least trustworthy and where molecular testing is most likely to alter biological interpretation.</w:t>
+        <w:t>This finding has direct clinical implications. Tumours with clearly non-luminal phenotypes are already reasonably well captured by routine biomarkers. By contrast, hormone receptor-positive/HER2-negative tumours near the Luminal A/Luminal B boundary remain the true zone of irreducible uncertainty [11]. The grey-zone analysis helps identify where routine methods are least trustworthy and where molecular testing is most likely to alter biological interpretation.</w:t>
       </w:r>
     </w:p>
     <w:p>
@@ -2795,7 +2852,7 @@
           <w:rFonts w:ascii="Times New Roman" w:hAnsi="Times New Roman"/>
           <w:sz w:val="24"/>
         </w:rPr>
-        <w:t>Our study also offers a broader methodological lesson. Algorithmic complexity cannot fully compensate for information-poor inputs. In this setting, the difference between logistic regression, random forest, and XGBoost was less important than the limited granularity of ER, PR, HER2, grade, and Ki-67 across public cohorts. This suggests that future efforts should focus less on increasingly complex classifiers built on the same routine variables and more on identifying what additional information—continuous biomarker measures, digital pathology, morphology-derived features, or true molecular data—is required to break the ceiling.</w:t>
+        <w:t>Our study also offers a broader methodological lesson. Algorithmic complexity cannot fully compensate for information-poor inputs. Future efforts should focus less on increasingly complex classifiers built on the same routine variables and more on identifying what additional information—continuous biomarker measures, digital pathology, or true molecular data—is required to break the ceiling.</w:t>
       </w:r>
     </w:p>
     <w:p>
@@ -2820,7 +2877,7 @@
           <w:rFonts w:ascii="Times New Roman" w:hAnsi="Times New Roman"/>
           <w:sz w:val="24"/>
         </w:rPr>
-        <w:t>Prior studies have shown incomplete concordance between immunohistochemical surrogates and PAM50, particularly in luminal disease [5,6,12]. Our results are aligned with that literature, but extend it in three ways: first, by testing multiple machine-learning approaches rather than only rule-based surrogates; second, by requiring strict external validation across independent cohorts and platforms; and third, by using head-to-head comparisons on identical evaluable subsets. These design choices make the negative result more rigorous and, in our view, more clinically informative.</w:t>
+        <w:t>Prior studies have shown incomplete concordance between immunohistochemical surrogates and PAM50, particularly in luminal disease [5,6,12]. Our results extend that literature by testing multiple machine-learning approaches rather than only rule-based surrogates, requiring strict external validation across independent cohorts and platforms, and using head-to-head comparisons on identical evaluable subsets.</w:t>
       </w:r>
     </w:p>
     <w:p>
@@ -2845,7 +2902,7 @@
           <w:rFonts w:ascii="Times New Roman" w:hAnsi="Times New Roman"/>
           <w:sz w:val="24"/>
         </w:rPr>
-        <w:t>Strengths include the use of four independent cohorts spanning two molecular platforms, strict external validation, matched-denominator comparisons between the surrogate and machine-learning models, bootstrap confidence intervals for all core metrics, and a grey-zone framework that translates prediction uncertainty into potential clinical utility.</w:t>
+        <w:t>Strengths include the use of four independent cohorts spanning two molecular platforms, strict external validation, matched-denominator comparisons, bootstrap confidence intervals for all core metrics, and a grey-zone framework that translates prediction uncertainty into potential clinical utility.</w:t>
       </w:r>
     </w:p>
     <w:p>
@@ -2857,19 +2914,7 @@
           <w:rFonts w:ascii="Times New Roman" w:hAnsi="Times New Roman"/>
           <w:sz w:val="24"/>
         </w:rPr>
-        <w:t>The study also has limitations. First, most routine biomarkers were available only in simplified categorical format, especially ER, PR, and HER2, likely underestimating the potential contribution of more granular pathology data. Second, continuous Ki-67 was available only in the smaller SCAN-B cohort, and histological grade was absent in TCGA-BRCA, limiting portability of enriched feature sets. Third, PAM50 labels were obtained from public resources with cohort-specific implementations. Fourth, this was a purely in silico study without outcome-based confirmation of the clinical consequences of discordant luminal assignments.</w:t>
-      </w:r>
-    </w:p>
-    <w:p>
-      <w:pPr>
-        <w:ind w:firstLine="720"/>
-      </w:pPr>
-      <w:r>
-        <w:rPr>
-          <w:rFonts w:ascii="Times New Roman" w:hAnsi="Times New Roman"/>
-          <w:sz w:val="24"/>
-        </w:rPr>
-        <w:t>These limitations do not weaken the core conclusion. If anything, they reflect the conditions under which routine surrogate subtyping is commonly used in practice.</w:t>
+        <w:t>Limitations include: most routine biomarkers were available only in simplified categorical format; continuous Ki-67 was available only in the smaller SCAN-B cohort; histological grade was absent in TCGA-BRCA; PAM50 labels were obtained from public resources with cohort-specific implementations; and this was a purely in silico study without outcome-based confirmation of clinical consequences. These limitations reflect the conditions under which routine surrogate subtyping is commonly used in practice.</w:t>
       </w:r>
     </w:p>
     <w:p>
@@ -2894,7 +2939,29 @@
           <w:rFonts w:ascii="Times New Roman" w:hAnsi="Times New Roman"/>
           <w:sz w:val="24"/>
         </w:rPr>
-        <w:t>Routine clinicopathological variables impose an information ceiling that prevents reliable reproduction of 4-class PAM50 intrinsic subtypes. Machine-learning models do not overcome this limitation because the main constraint lies in the input data, not in the classifier. The irreducible uncertainty concentrates at the Luminal A/Luminal B boundary, defining a clinically relevant grey zone in which molecular testing is most likely to add value. These findings support a selective, rather than indiscriminate, use of molecular subtyping in breast cancer.</w:t>
+        <w:t>Routine clinicopathological variables impose an information ceiling that prevents reliable reproduction of 4-class PAM50 intrinsic subtypes. Machine-learning models do not overcome this limitation because the main constraint lies in the input data rather than the classifier. The irreducible uncertainty concentrates at the Luminal A/Luminal B boundary, defining a clinically meaningful grey zone in which molecular testing is most likely to refine biological classification and add practical value.</w:t>
+      </w:r>
+    </w:p>
+    <w:p>
+      <w:pPr>
+        <w:spacing w:before="360" w:after="120"/>
+      </w:pPr>
+      <w:r>
+        <w:rPr>
+          <w:rFonts w:ascii="Times New Roman" w:hAnsi="Times New Roman"/>
+          <w:b/>
+          <w:sz w:val="28"/>
+        </w:rPr>
+        <w:t>Ethics statement</w:t>
+      </w:r>
+    </w:p>
+    <w:p>
+      <w:r>
+        <w:rPr>
+          <w:rFonts w:ascii="Times New Roman" w:hAnsi="Times New Roman"/>
+          <w:sz w:val="24"/>
+        </w:rPr>
+        <w:t>Ethics approval and informed consent were not required because this study used only publicly available, de-identified datasets and involved no direct patient contact or new biological material.</w:t>
       </w:r>
     </w:p>
     <w:p>
@@ -3005,7 +3072,7 @@
           <w:rFonts w:ascii="Times New Roman" w:hAnsi="Times New Roman"/>
           <w:sz w:val="24"/>
         </w:rPr>
-        <w:t>During the preparation of this work the author(s) used Claude 3.5 Sonnet and Claude Opus 4 (Anthropic) in order to assist with Python and R code development for data acquisition, statistical modelling, bootstrap analysis, and publication-quality figure generation. The author(s) also used ChatGPT-4o (OpenAI) in order to support language editing and structural refinement of the manuscript text. After using these tools, the author(s) reviewed and edited the content as needed and take(s) full responsibility for the content of the published article.</w:t>
+        <w:t>During the preparation of this work, the authors used generative AI tools to assist with code refinement, language editing, and structural revision of the manuscript. After using these tools, the authors reviewed and edited the content as needed and take full responsibility for the content of the published article.</w:t>
       </w:r>
     </w:p>
     <w:p>
@@ -3027,7 +3094,7 @@
           <w:rFonts w:ascii="Times New Roman" w:hAnsi="Times New Roman"/>
           <w:sz w:val="24"/>
         </w:rPr>
-        <w:t>All data used in this study are publicly available. GSE81538 and GSE96058 are available through NCBI GEO; TCGA-BRCA and METABRIC clinical data were accessed through cBioPortal. Complete analysis code and reproducibility materials are available at: https://github.com/oncologista/pam50-ihc-ml</w:t>
+        <w:t>All data used in this study are publicly available. GSE81538 and GSE96058 are available through NCBI GEO; TCGA-BRCA and METABRIC clinical data were accessed through cBioPortal. Analysis code and reproducibility materials will be made publicly available upon acceptance.</w:t>
       </w:r>
     </w:p>
     <w:p>
@@ -3178,7 +3245,7 @@
         <w:drawing>
           <wp:inline xmlns:a="http://schemas.openxmlformats.org/drawingml/2006/main" xmlns:pic="http://schemas.openxmlformats.org/drawingml/2006/picture">
             <wp:extent cx="5029200" cy="3592286"/>
-            <wp:docPr id="7" name="Picture 7"/>
+            <wp:docPr id="6" name="Picture 6"/>
             <wp:cNvGraphicFramePr>
               <a:graphicFrameLocks noChangeAspect="1"/>
             </wp:cNvGraphicFramePr>
@@ -3190,7 +3257,7 @@
                     <pic:cNvPicPr/>
                   </pic:nvPicPr>
                   <pic:blipFill>
-                    <a:blip r:embed="rId15"/>
+                    <a:blip r:embed="rId14"/>
                     <a:stretch>
                       <a:fillRect/>
                     </a:stretch>
@@ -3231,7 +3298,7 @@
         <w:drawing>
           <wp:inline xmlns:a="http://schemas.openxmlformats.org/drawingml/2006/main" xmlns:pic="http://schemas.openxmlformats.org/drawingml/2006/picture">
             <wp:extent cx="5029200" cy="3233057"/>
-            <wp:docPr id="8" name="Picture 8"/>
+            <wp:docPr id="7" name="Picture 7"/>
             <wp:cNvGraphicFramePr>
               <a:graphicFrameLocks noChangeAspect="1"/>
             </wp:cNvGraphicFramePr>
@@ -3243,7 +3310,7 @@
                     <pic:cNvPicPr/>
                   </pic:nvPicPr>
                   <pic:blipFill>
-                    <a:blip r:embed="rId16"/>
+                    <a:blip r:embed="rId15"/>
                     <a:stretch>
                       <a:fillRect/>
                     </a:stretch>
@@ -3284,7 +3351,7 @@
         <w:drawing>
           <wp:inline xmlns:a="http://schemas.openxmlformats.org/drawingml/2006/main" xmlns:pic="http://schemas.openxmlformats.org/drawingml/2006/picture">
             <wp:extent cx="5029200" cy="3951514"/>
-            <wp:docPr id="9" name="Picture 9"/>
+            <wp:docPr id="8" name="Picture 8"/>
             <wp:cNvGraphicFramePr>
               <a:graphicFrameLocks noChangeAspect="1"/>
             </wp:cNvGraphicFramePr>
@@ -3296,7 +3363,7 @@
                     <pic:cNvPicPr/>
                   </pic:nvPicPr>
                   <pic:blipFill>
-                    <a:blip r:embed="rId17"/>
+                    <a:blip r:embed="rId16"/>
                     <a:stretch>
                       <a:fillRect/>
                     </a:stretch>
@@ -3337,7 +3404,7 @@
         <w:drawing>
           <wp:inline xmlns:a="http://schemas.openxmlformats.org/drawingml/2006/main" xmlns:pic="http://schemas.openxmlformats.org/drawingml/2006/picture">
             <wp:extent cx="5029200" cy="3457575"/>
-            <wp:docPr id="10" name="Picture 10"/>
+            <wp:docPr id="9" name="Picture 9"/>
             <wp:cNvGraphicFramePr>
               <a:graphicFrameLocks noChangeAspect="1"/>
             </wp:cNvGraphicFramePr>
@@ -3349,7 +3416,7 @@
                     <pic:cNvPicPr/>
                   </pic:nvPicPr>
                   <pic:blipFill>
-                    <a:blip r:embed="rId18"/>
+                    <a:blip r:embed="rId17"/>
                     <a:stretch>
                       <a:fillRect/>
                     </a:stretch>
@@ -3379,6 +3446,59 @@
           <w:sz w:val="20"/>
         </w:rPr>
         <w:t>Supplementary Fig. S4. Feature set comparison across cohorts.</w:t>
+      </w:r>
+    </w:p>
+    <w:p>
+      <w:pPr>
+        <w:spacing w:before="240"/>
+        <w:jc w:val="center"/>
+      </w:pPr>
+      <w:r>
+        <w:drawing>
+          <wp:inline xmlns:a="http://schemas.openxmlformats.org/drawingml/2006/main" xmlns:pic="http://schemas.openxmlformats.org/drawingml/2006/picture">
+            <wp:extent cx="5029200" cy="3352800"/>
+            <wp:docPr id="10" name="Picture 10"/>
+            <wp:cNvGraphicFramePr>
+              <a:graphicFrameLocks noChangeAspect="1"/>
+            </wp:cNvGraphicFramePr>
+            <a:graphic>
+              <a:graphicData uri="http://schemas.openxmlformats.org/drawingml/2006/picture">
+                <pic:pic>
+                  <pic:nvPicPr>
+                    <pic:cNvPr id="0" name="fig10_information_ceiling.png"/>
+                    <pic:cNvPicPr/>
+                  </pic:nvPicPr>
+                  <pic:blipFill>
+                    <a:blip r:embed="rId18"/>
+                    <a:stretch>
+                      <a:fillRect/>
+                    </a:stretch>
+                  </pic:blipFill>
+                  <pic:spPr>
+                    <a:xfrm>
+                      <a:off x="0" y="0"/>
+                      <a:ext cx="5029200" cy="3352800"/>
+                    </a:xfrm>
+                    <a:prstGeom prst="rect"/>
+                  </pic:spPr>
+                </pic:pic>
+              </a:graphicData>
+            </a:graphic>
+          </wp:inline>
+        </w:drawing>
+      </w:r>
+    </w:p>
+    <w:p>
+      <w:pPr>
+        <w:spacing w:after="240"/>
+      </w:pPr>
+      <w:r>
+        <w:rPr>
+          <w:rFonts w:ascii="Times New Roman" w:hAnsi="Times New Roman"/>
+          <w:i/>
+          <w:sz w:val="20"/>
+        </w:rPr>
+        <w:t>Supplementary Fig. S5. Conceptual summary of the information ceiling. Performance increases modestly with additional routine features but remains below the molecular reference, supporting the interpretation that the principal limitation lies in input information content rather than model architecture.</w:t>
       </w:r>
     </w:p>
     <w:sectPr>

</xml_diff>

<commit_message>
Fix Table 4 ambiguity: explicit model, feature set, and denominator
- Table 4 now includes Model and Feature Set columns (XGBoost, Set 1)
- Footnote clarifies that 4-class values (0.514, 0.522) use Set 1 on
  full evaluable subsets, not the Set 2 matched H2H values from Sec 3.3
- Section 3.6 adds explicit paragraph explaining the numeric difference
  between Table 4 (0.522) and Section 3.3 (0.559)

Co-Authored-By: Claude Opus 4.6 <noreply@anthropic.com>
</commit_message>
<xml_diff>
--- a/manuscript/manuscript_TheBreast_FINAL.docx
+++ b/manuscript/manuscript_TheBreast_FINAL.docx
@@ -2275,7 +2275,19 @@
           <w:rFonts w:ascii="Times New Roman" w:hAnsi="Times New Roman"/>
           <w:sz w:val="24"/>
         </w:rPr>
-        <w:t>Collapsing Luminal A and Luminal B into a single luminal class substantially improved performance. Macro-F1 increased from 0.514 to 0.777 in TCGA-BRCA and from 0.522 to 0.767 in METABRIC (Table 4). This result is central to interpretation: most of the classification deficit resides within the luminal boundary rather than in the broader separation of luminal, HER2-enriched, and Basal-like disease.</w:t>
+        <w:t>Collapsing Luminal A and Luminal B into a single luminal class substantially improved performance. Using the best Set 1 model (XGBoost) on the largest evaluable subsets, macro-F1 increased from 0.514 to 0.777 in TCGA-BRCA (n=435) and from 0.522 to 0.767 in METABRIC (n=1,608) (Table 4). This result is central to interpretation: most of the classification deficit resides within the luminal boundary rather than in the broader separation of luminal, HER2-enriched, and Basal-like disease.</w:t>
+      </w:r>
+    </w:p>
+    <w:p>
+      <w:pPr>
+        <w:ind w:firstLine="720"/>
+      </w:pPr>
+      <w:r>
+        <w:rPr>
+          <w:rFonts w:ascii="Times New Roman" w:hAnsi="Times New Roman"/>
+          <w:sz w:val="24"/>
+        </w:rPr>
+        <w:t>The 4-class baseline values in Table 4 (0.514 and 0.522) correspond to XGBoost Set 1 applied to the full model-evaluable subsets and are therefore not directly comparable to the matched head-to-head values reported in Section 3.3 (0.559 for XGBoost Set 2, n=1,544), which use a different feature set and a different denominator.</w:t>
       </w:r>
     </w:p>
     <w:p>
@@ -2299,17 +2311,19 @@
         <w:tblLook w:firstColumn="1" w:firstRow="1" w:lastColumn="0" w:lastRow="0" w:noHBand="0" w:noVBand="1" w:val="04A0"/>
       </w:tblPr>
       <w:tblGrid>
-        <w:gridCol w:w="1440"/>
-        <w:gridCol w:w="1440"/>
-        <w:gridCol w:w="1440"/>
-        <w:gridCol w:w="1440"/>
-        <w:gridCol w:w="1440"/>
-        <w:gridCol w:w="1440"/>
+        <w:gridCol w:w="1080"/>
+        <w:gridCol w:w="1080"/>
+        <w:gridCol w:w="1080"/>
+        <w:gridCol w:w="1080"/>
+        <w:gridCol w:w="1080"/>
+        <w:gridCol w:w="1080"/>
+        <w:gridCol w:w="1080"/>
+        <w:gridCol w:w="1080"/>
       </w:tblGrid>
       <w:tr>
         <w:tc>
           <w:tcPr>
-            <w:tcW w:type="dxa" w:w="1440"/>
+            <w:tcW w:type="dxa" w:w="1080"/>
           </w:tcPr>
           <w:p>
             <w:r>
@@ -2324,7 +2338,37 @@
         </w:tc>
         <w:tc>
           <w:tcPr>
-            <w:tcW w:type="dxa" w:w="1440"/>
+            <w:tcW w:type="dxa" w:w="1080"/>
+          </w:tcPr>
+          <w:p>
+            <w:r>
+              <w:rPr>
+                <w:rFonts w:ascii="Times New Roman" w:hAnsi="Times New Roman"/>
+                <w:b/>
+                <w:sz w:val="18"/>
+              </w:rPr>
+              <w:t>Model</w:t>
+            </w:r>
+          </w:p>
+        </w:tc>
+        <w:tc>
+          <w:tcPr>
+            <w:tcW w:type="dxa" w:w="1080"/>
+          </w:tcPr>
+          <w:p>
+            <w:r>
+              <w:rPr>
+                <w:rFonts w:ascii="Times New Roman" w:hAnsi="Times New Roman"/>
+                <w:b/>
+                <w:sz w:val="18"/>
+              </w:rPr>
+              <w:t>Feature Set</w:t>
+            </w:r>
+          </w:p>
+        </w:tc>
+        <w:tc>
+          <w:tcPr>
+            <w:tcW w:type="dxa" w:w="1080"/>
           </w:tcPr>
           <w:p>
             <w:r>
@@ -2339,7 +2383,7 @@
         </w:tc>
         <w:tc>
           <w:tcPr>
-            <w:tcW w:type="dxa" w:w="1440"/>
+            <w:tcW w:type="dxa" w:w="1080"/>
           </w:tcPr>
           <w:p>
             <w:r>
@@ -2354,7 +2398,7 @@
         </w:tc>
         <w:tc>
           <w:tcPr>
-            <w:tcW w:type="dxa" w:w="1440"/>
+            <w:tcW w:type="dxa" w:w="1080"/>
           </w:tcPr>
           <w:p>
             <w:r>
@@ -2369,7 +2413,7 @@
         </w:tc>
         <w:tc>
           <w:tcPr>
-            <w:tcW w:type="dxa" w:w="1440"/>
+            <w:tcW w:type="dxa" w:w="1080"/>
           </w:tcPr>
           <w:p>
             <w:r>
@@ -2384,7 +2428,7 @@
         </w:tc>
         <w:tc>
           <w:tcPr>
-            <w:tcW w:type="dxa" w:w="1440"/>
+            <w:tcW w:type="dxa" w:w="1080"/>
           </w:tcPr>
           <w:p>
             <w:r>
@@ -2401,7 +2445,7 @@
       <w:tr>
         <w:tc>
           <w:tcPr>
-            <w:tcW w:type="dxa" w:w="1440"/>
+            <w:tcW w:type="dxa" w:w="1080"/>
           </w:tcPr>
           <w:p>
             <w:r>
@@ -2415,7 +2459,35 @@
         </w:tc>
         <w:tc>
           <w:tcPr>
-            <w:tcW w:type="dxa" w:w="1440"/>
+            <w:tcW w:type="dxa" w:w="1080"/>
+          </w:tcPr>
+          <w:p>
+            <w:r>
+              <w:rPr>
+                <w:rFonts w:ascii="Times New Roman" w:hAnsi="Times New Roman"/>
+                <w:sz w:val="18"/>
+              </w:rPr>
+              <w:t>XGBoost</w:t>
+            </w:r>
+          </w:p>
+        </w:tc>
+        <w:tc>
+          <w:tcPr>
+            <w:tcW w:type="dxa" w:w="1080"/>
+          </w:tcPr>
+          <w:p>
+            <w:r>
+              <w:rPr>
+                <w:rFonts w:ascii="Times New Roman" w:hAnsi="Times New Roman"/>
+                <w:sz w:val="18"/>
+              </w:rPr>
+              <w:t>Set 1 (ER, PR, HER2)</w:t>
+            </w:r>
+          </w:p>
+        </w:tc>
+        <w:tc>
+          <w:tcPr>
+            <w:tcW w:type="dxa" w:w="1080"/>
           </w:tcPr>
           <w:p>
             <w:r>
@@ -2429,7 +2501,7 @@
         </w:tc>
         <w:tc>
           <w:tcPr>
-            <w:tcW w:type="dxa" w:w="1440"/>
+            <w:tcW w:type="dxa" w:w="1080"/>
           </w:tcPr>
           <w:p>
             <w:r>
@@ -2443,7 +2515,7 @@
         </w:tc>
         <w:tc>
           <w:tcPr>
-            <w:tcW w:type="dxa" w:w="1440"/>
+            <w:tcW w:type="dxa" w:w="1080"/>
           </w:tcPr>
           <w:p>
             <w:r>
@@ -2457,7 +2529,7 @@
         </w:tc>
         <w:tc>
           <w:tcPr>
-            <w:tcW w:type="dxa" w:w="1440"/>
+            <w:tcW w:type="dxa" w:w="1080"/>
           </w:tcPr>
           <w:p>
             <w:r>
@@ -2471,7 +2543,7 @@
         </w:tc>
         <w:tc>
           <w:tcPr>
-            <w:tcW w:type="dxa" w:w="1440"/>
+            <w:tcW w:type="dxa" w:w="1080"/>
           </w:tcPr>
           <w:p>
             <w:r>
@@ -2487,7 +2559,7 @@
       <w:tr>
         <w:tc>
           <w:tcPr>
-            <w:tcW w:type="dxa" w:w="1440"/>
+            <w:tcW w:type="dxa" w:w="1080"/>
           </w:tcPr>
           <w:p>
             <w:r>
@@ -2501,7 +2573,35 @@
         </w:tc>
         <w:tc>
           <w:tcPr>
-            <w:tcW w:type="dxa" w:w="1440"/>
+            <w:tcW w:type="dxa" w:w="1080"/>
+          </w:tcPr>
+          <w:p>
+            <w:r>
+              <w:rPr>
+                <w:rFonts w:ascii="Times New Roman" w:hAnsi="Times New Roman"/>
+                <w:sz w:val="18"/>
+              </w:rPr>
+              <w:t>XGBoost</w:t>
+            </w:r>
+          </w:p>
+        </w:tc>
+        <w:tc>
+          <w:tcPr>
+            <w:tcW w:type="dxa" w:w="1080"/>
+          </w:tcPr>
+          <w:p>
+            <w:r>
+              <w:rPr>
+                <w:rFonts w:ascii="Times New Roman" w:hAnsi="Times New Roman"/>
+                <w:sz w:val="18"/>
+              </w:rPr>
+              <w:t>Set 1 (ER, PR, HER2)</w:t>
+            </w:r>
+          </w:p>
+        </w:tc>
+        <w:tc>
+          <w:tcPr>
+            <w:tcW w:type="dxa" w:w="1080"/>
           </w:tcPr>
           <w:p>
             <w:r>
@@ -2515,7 +2615,7 @@
         </w:tc>
         <w:tc>
           <w:tcPr>
-            <w:tcW w:type="dxa" w:w="1440"/>
+            <w:tcW w:type="dxa" w:w="1080"/>
           </w:tcPr>
           <w:p>
             <w:r>
@@ -2529,7 +2629,7 @@
         </w:tc>
         <w:tc>
           <w:tcPr>
-            <w:tcW w:type="dxa" w:w="1440"/>
+            <w:tcW w:type="dxa" w:w="1080"/>
           </w:tcPr>
           <w:p>
             <w:r>
@@ -2543,7 +2643,7 @@
         </w:tc>
         <w:tc>
           <w:tcPr>
-            <w:tcW w:type="dxa" w:w="1440"/>
+            <w:tcW w:type="dxa" w:w="1080"/>
           </w:tcPr>
           <w:p>
             <w:r>
@@ -2557,7 +2657,7 @@
         </w:tc>
         <w:tc>
           <w:tcPr>
-            <w:tcW w:type="dxa" w:w="1440"/>
+            <w:tcW w:type="dxa" w:w="1080"/>
           </w:tcPr>
           <w:p>
             <w:r>
@@ -2573,7 +2673,7 @@
       <w:tr>
         <w:tc>
           <w:tcPr>
-            <w:tcW w:type="dxa" w:w="1440"/>
+            <w:tcW w:type="dxa" w:w="1080"/>
           </w:tcPr>
           <w:p>
             <w:r>
@@ -2587,7 +2687,35 @@
         </w:tc>
         <w:tc>
           <w:tcPr>
-            <w:tcW w:type="dxa" w:w="1440"/>
+            <w:tcW w:type="dxa" w:w="1080"/>
+          </w:tcPr>
+          <w:p>
+            <w:r>
+              <w:rPr>
+                <w:rFonts w:ascii="Times New Roman" w:hAnsi="Times New Roman"/>
+                <w:sz w:val="18"/>
+              </w:rPr>
+              <w:t>XGBoost</w:t>
+            </w:r>
+          </w:p>
+        </w:tc>
+        <w:tc>
+          <w:tcPr>
+            <w:tcW w:type="dxa" w:w="1080"/>
+          </w:tcPr>
+          <w:p>
+            <w:r>
+              <w:rPr>
+                <w:rFonts w:ascii="Times New Roman" w:hAnsi="Times New Roman"/>
+                <w:sz w:val="18"/>
+              </w:rPr>
+              <w:t>Set 1 (ER, PR, HER2)</w:t>
+            </w:r>
+          </w:p>
+        </w:tc>
+        <w:tc>
+          <w:tcPr>
+            <w:tcW w:type="dxa" w:w="1080"/>
           </w:tcPr>
           <w:p>
             <w:r>
@@ -2601,7 +2729,7 @@
         </w:tc>
         <w:tc>
           <w:tcPr>
-            <w:tcW w:type="dxa" w:w="1440"/>
+            <w:tcW w:type="dxa" w:w="1080"/>
           </w:tcPr>
           <w:p>
             <w:r>
@@ -2615,7 +2743,7 @@
         </w:tc>
         <w:tc>
           <w:tcPr>
-            <w:tcW w:type="dxa" w:w="1440"/>
+            <w:tcW w:type="dxa" w:w="1080"/>
           </w:tcPr>
           <w:p>
             <w:r>
@@ -2629,7 +2757,7 @@
         </w:tc>
         <w:tc>
           <w:tcPr>
-            <w:tcW w:type="dxa" w:w="1440"/>
+            <w:tcW w:type="dxa" w:w="1080"/>
           </w:tcPr>
           <w:p>
             <w:r>
@@ -2643,7 +2771,7 @@
         </w:tc>
         <w:tc>
           <w:tcPr>
-            <w:tcW w:type="dxa" w:w="1440"/>
+            <w:tcW w:type="dxa" w:w="1080"/>
           </w:tcPr>
           <w:p>
             <w:r>
@@ -2659,7 +2787,7 @@
       <w:tr>
         <w:tc>
           <w:tcPr>
-            <w:tcW w:type="dxa" w:w="1440"/>
+            <w:tcW w:type="dxa" w:w="1080"/>
           </w:tcPr>
           <w:p>
             <w:r>
@@ -2673,7 +2801,35 @@
         </w:tc>
         <w:tc>
           <w:tcPr>
-            <w:tcW w:type="dxa" w:w="1440"/>
+            <w:tcW w:type="dxa" w:w="1080"/>
+          </w:tcPr>
+          <w:p>
+            <w:r>
+              <w:rPr>
+                <w:rFonts w:ascii="Times New Roman" w:hAnsi="Times New Roman"/>
+                <w:sz w:val="18"/>
+              </w:rPr>
+              <w:t>XGBoost</w:t>
+            </w:r>
+          </w:p>
+        </w:tc>
+        <w:tc>
+          <w:tcPr>
+            <w:tcW w:type="dxa" w:w="1080"/>
+          </w:tcPr>
+          <w:p>
+            <w:r>
+              <w:rPr>
+                <w:rFonts w:ascii="Times New Roman" w:hAnsi="Times New Roman"/>
+                <w:sz w:val="18"/>
+              </w:rPr>
+              <w:t>Set 1 (ER, PR, HER2)</w:t>
+            </w:r>
+          </w:p>
+        </w:tc>
+        <w:tc>
+          <w:tcPr>
+            <w:tcW w:type="dxa" w:w="1080"/>
           </w:tcPr>
           <w:p>
             <w:r>
@@ -2687,7 +2843,7 @@
         </w:tc>
         <w:tc>
           <w:tcPr>
-            <w:tcW w:type="dxa" w:w="1440"/>
+            <w:tcW w:type="dxa" w:w="1080"/>
           </w:tcPr>
           <w:p>
             <w:r>
@@ -2701,7 +2857,7 @@
         </w:tc>
         <w:tc>
           <w:tcPr>
-            <w:tcW w:type="dxa" w:w="1440"/>
+            <w:tcW w:type="dxa" w:w="1080"/>
           </w:tcPr>
           <w:p>
             <w:r>
@@ -2715,7 +2871,7 @@
         </w:tc>
         <w:tc>
           <w:tcPr>
-            <w:tcW w:type="dxa" w:w="1440"/>
+            <w:tcW w:type="dxa" w:w="1080"/>
           </w:tcPr>
           <w:p>
             <w:r>
@@ -2729,7 +2885,7 @@
         </w:tc>
         <w:tc>
           <w:tcPr>
-            <w:tcW w:type="dxa" w:w="1440"/>
+            <w:tcW w:type="dxa" w:w="1080"/>
           </w:tcPr>
           <w:p>
             <w:r>
@@ -2753,7 +2909,7 @@
           <w:i/>
           <w:sz w:val="16"/>
         </w:rPr>
-        <w:t>Values in this table refer to the largest evaluable subset for each machine-learning analysis and are not directly equivalent to matched head-to-head comparisons with the immunohistochemical surrogate. All direct surrogate-versus-model comparisons are reported separately using identical denominators (see Section 3.3).</w:t>
+        <w:t>All values refer to XGBoost Set 1 (ER, PR, HER2) applied to the largest model-evaluable subset in each cohort. The 4-class macro-F1 values (0.514 and 0.522) are therefore not directly comparable to the matched head-to-head results in Section 3.3, which use XGBoost Set 2 (+ grade) on a different denominator (n=1,544 in METABRIC). All direct surrogate-versus-model comparisons are reported separately using identical denominators.</w:t>
       </w:r>
     </w:p>
     <w:p/>

</xml_diff>

<commit_message>
Add Sandro José Martins as co-author
Authors now: Botan (1st), Martins (2nd), Sousa (3rd/senior)
Affiliation: Oncology Unit, HUB/EBSERH, Universidade de Brasília
CRediT: Validation, Writing – review & editing

Co-Authored-By: Claude Opus 4.6 <noreply@anthropic.com>
</commit_message>
<xml_diff>
--- a/manuscript/manuscript_TheBreast_FINAL.docx
+++ b/manuscript/manuscript_TheBreast_FINAL.docx
@@ -41,6 +41,21 @@
           <w:rFonts w:ascii="Times New Roman" w:hAnsi="Times New Roman"/>
           <w:sz w:val="24"/>
         </w:rPr>
+        <w:t xml:space="preserve">, Sandro José Martins </w:t>
+      </w:r>
+      <w:r>
+        <w:rPr>
+          <w:rFonts w:ascii="Times New Roman" w:hAnsi="Times New Roman"/>
+          <w:sz w:val="24"/>
+          <w:vertAlign w:val="superscript"/>
+        </w:rPr>
+        <w:t>2</w:t>
+      </w:r>
+      <w:r>
+        <w:rPr>
+          <w:rFonts w:ascii="Times New Roman" w:hAnsi="Times New Roman"/>
+          <w:sz w:val="24"/>
+        </w:rPr>
         <w:t xml:space="preserve">, João Batista de Sousa </w:t>
       </w:r>
       <w:r>
@@ -49,7 +64,7 @@
           <w:sz w:val="24"/>
           <w:vertAlign w:val="superscript"/>
         </w:rPr>
-        <w:t>2</w:t>
+        <w:t>3</w:t>
       </w:r>
     </w:p>
     <w:p/>
@@ -76,7 +91,20 @@
           <w:i/>
           <w:sz w:val="20"/>
         </w:rPr>
-        <w:t>² Department of Proctology, Universidade de Brasília, Brasília, Brazil</w:t>
+        <w:t>² Oncology Unit, Hospital Universitário de Brasília (HUB/EBSERH), Universidade de Brasília, Brasília, Brazil</w:t>
+      </w:r>
+    </w:p>
+    <w:p>
+      <w:pPr>
+        <w:jc w:val="center"/>
+      </w:pPr>
+      <w:r>
+        <w:rPr>
+          <w:rFonts w:ascii="Times New Roman" w:hAnsi="Times New Roman"/>
+          <w:i/>
+          <w:sz w:val="20"/>
+        </w:rPr>
+        <w:t>³ Department of Proctology, Universidade de Brasília, Brasília, Brazil</w:t>
       </w:r>
     </w:p>
     <w:p>
@@ -3199,6 +3227,21 @@
           <w:b/>
           <w:sz w:val="24"/>
         </w:rPr>
+        <w:t xml:space="preserve">Sandro José Martins: </w:t>
+      </w:r>
+      <w:r>
+        <w:rPr>
+          <w:rFonts w:ascii="Times New Roman" w:hAnsi="Times New Roman"/>
+          <w:sz w:val="24"/>
+        </w:rPr>
+        <w:t xml:space="preserve">Validation, Writing – review &amp; editing. </w:t>
+      </w:r>
+      <w:r>
+        <w:rPr>
+          <w:rFonts w:ascii="Times New Roman" w:hAnsi="Times New Roman"/>
+          <w:b/>
+          <w:sz w:val="24"/>
+        </w:rPr>
         <w:t xml:space="preserve">João Batista de Sousa: </w:t>
       </w:r>
       <w:r>

</xml_diff>

<commit_message>
Sandro Martins shares affiliation 1 (Dept. Oncology, UnB)
Rafael de Negreiros Botan 1,*
Sandro José Martins 1
João Batista de Sousa 2

1 Department of Oncology, Universidade de Brasília
2 Department of Proctology, Universidade de Brasília

Co-Authored-By: Claude Opus 4.6 <noreply@anthropic.com>
</commit_message>
<xml_diff>
--- a/manuscript/manuscript_TheBreast_FINAL.docx
+++ b/manuscript/manuscript_TheBreast_FINAL.docx
@@ -49,7 +49,7 @@
           <w:sz w:val="24"/>
           <w:vertAlign w:val="superscript"/>
         </w:rPr>
-        <w:t>2</w:t>
+        <w:t>1</w:t>
       </w:r>
       <w:r>
         <w:rPr>
@@ -64,7 +64,7 @@
           <w:sz w:val="24"/>
           <w:vertAlign w:val="superscript"/>
         </w:rPr>
-        <w:t>3</w:t>
+        <w:t>2</w:t>
       </w:r>
     </w:p>
     <w:p/>
@@ -91,20 +91,7 @@
           <w:i/>
           <w:sz w:val="20"/>
         </w:rPr>
-        <w:t>² Oncology Unit, Hospital Universitário de Brasília (HUB/EBSERH), Universidade de Brasília, Brasília, Brazil</w:t>
-      </w:r>
-    </w:p>
-    <w:p>
-      <w:pPr>
-        <w:jc w:val="center"/>
-      </w:pPr>
-      <w:r>
-        <w:rPr>
-          <w:rFonts w:ascii="Times New Roman" w:hAnsi="Times New Roman"/>
-          <w:i/>
-          <w:sz w:val="20"/>
-        </w:rPr>
-        <w:t>³ Department of Proctology, Universidade de Brasília, Brasília, Brazil</w:t>
+        <w:t>² Department of Proctology, Universidade de Brasília, Brasília, Brazil</w:t>
       </w:r>
     </w:p>
     <w:p>

</xml_diff>

<commit_message>
Align section headings with The Breast submission requirements
- "Declaration of competing interest" → "Conflict of interest statement"
- "Funding" → "Role of the funding source" with full sponsor declaration
- Regenerated all Word manuscripts

Co-Authored-By: Claude Opus 4.6 <noreply@anthropic.com>
</commit_message>
<xml_diff>
--- a/manuscript/manuscript_TheBreast_FINAL.docx
+++ b/manuscript/manuscript_TheBreast_FINAL.docx
@@ -3145,7 +3145,7 @@
           <w:b/>
           <w:sz w:val="28"/>
         </w:rPr>
-        <w:t>Funding</w:t>
+        <w:t>Role of the funding source</w:t>
       </w:r>
     </w:p>
     <w:p>
@@ -3154,7 +3154,7 @@
           <w:rFonts w:ascii="Times New Roman" w:hAnsi="Times New Roman"/>
           <w:sz w:val="24"/>
         </w:rPr>
-        <w:t>This research did not receive any specific grant from funding agencies in the public, commercial, or not-for-profit sectors.</w:t>
+        <w:t>This research did not receive any specific grant from funding agencies in the public, commercial, or not-for-profit sectors. No study sponsor was involved in the study design; in the collection, analysis, and interpretation of data; in the writing of the manuscript; or in the decision to submit the manuscript for publication.</w:t>
       </w:r>
     </w:p>
     <w:p>
@@ -3167,7 +3167,7 @@
           <w:b/>
           <w:sz w:val="28"/>
         </w:rPr>
-        <w:t>Declaration of competing interest</w:t>
+        <w:t>Conflict of interest statement</w:t>
       </w:r>
     </w:p>
     <w:p>

</xml_diff>